<commit_message>
Update CV details to reflect 11 years of experience and adjust job listings
- Changed experience count from 13 to 11 years in all CV formats (DOCX, PDF, TXT).
- Updated job experience section to exclude Vertex Info Solutions and added a new project related to WordPress multisite management.
- Modified ATS summary and headline to use the new experience count.
- Adjusted the model and verification scripts to account for hidden jobs in the experience section.
</commit_message>
<xml_diff>
--- a/latestCV/Maninder-Singh-Full-Stack-React-Engineer.docx
+++ b/latestCV/Maninder-Singh-Full-Stack-React-Engineer.docx
@@ -69,7 +69,7 @@
         </w:rPr>
         <w:t xml:space="preserve">  |  </w:t>
       </w:r>
-      <w:hyperlink w:history="1" r:id="rIdblmjdqvhdp9uxt47oemfp">
+      <w:hyperlink w:history="1" r:id="rIduunvpqyp6ppdjddvlyxal">
         <w:r>
           <w:rPr>
             <w:b/>
@@ -91,7 +91,7 @@
         </w:rPr>
         <w:t xml:space="preserve">  |  </w:t>
       </w:r>
-      <w:hyperlink w:history="1" r:id="rIdvk4svwtvk0vbcya760ial">
+      <w:hyperlink w:history="1" r:id="rId8bmpuw2hjm1m1x94tednj">
         <w:r>
           <w:rPr>
             <w:b/>
@@ -171,7 +171,7 @@
           <w:szCs w:val="20"/>
           <w:rFonts w:ascii="Calibri" w:cs="Calibri" w:eastAsia="Calibri" w:hAnsi="Calibri"/>
         </w:rPr>
-        <w:t xml:space="preserve">13 years of experience</w:t>
+        <w:t xml:space="preserve">11 years of experience</w:t>
       </w:r>
       <w:r>
         <w:rPr>
@@ -1030,148 +1030,41 @@
     </w:p>
     <w:p>
       <w:pPr>
-        <w:pStyle w:val="Heading3"/>
-        <w:tabs>
-          <w:tab w:val="right" w:pos="10180"/>
-        </w:tabs>
-        <w:spacing w:before="110" w:after="0"/>
-        <w:outlineLvl w:val="2"/>
-      </w:pPr>
-      <w:r>
-        <w:rPr>
-          <w:b/>
-          <w:bCs/>
-          <w:u w:val="single" w:color="5B4B8A"/>
-          <w:color w:val="5B4B8A"/>
-          <w:sz w:val="21"/>
-          <w:szCs w:val="21"/>
-          <w:caps/>
-          <w:rFonts w:ascii="Calibri" w:cs="Calibri" w:eastAsia="Calibri" w:hAnsi="Calibri"/>
-        </w:rPr>
-        <w:t xml:space="preserve">Software Developer</w:t>
-      </w:r>
-      <w:r>
-        <w:rPr>
-          <w:color w:val="7A68B0"/>
-          <w:sz w:val="20"/>
-          <w:szCs w:val="20"/>
-          <w:rFonts w:ascii="Calibri" w:cs="Calibri" w:eastAsia="Calibri" w:hAnsi="Calibri"/>
-        </w:rPr>
-        <w:t xml:space="preserve"> </w:t>
-        <w:tab/>
-        <w:t xml:space="preserve"> July 2013 - September 2015</w:t>
-      </w:r>
-    </w:p>
-    <w:p>
-      <w:pPr>
-        <w:spacing w:after="50"/>
-      </w:pPr>
-      <w:r>
-        <w:rPr>
-          <w:color w:val="7A68B0"/>
-          <w:sz w:val="20"/>
-          <w:szCs w:val="20"/>
-          <w:rFonts w:ascii="Calibri" w:cs="Calibri" w:eastAsia="Calibri" w:hAnsi="Calibri"/>
-        </w:rPr>
-        <w:t xml:space="preserve">Vertex Info Solutions, Chandigarh, India</w:t>
-      </w:r>
-    </w:p>
-    <w:p>
-      <w:pPr>
-        <w:pStyle w:val="ListParagraph"/>
-        <w:numPr>
-          <w:ilvl w:val="0"/>
-          <w:numId w:val="2"/>
-        </w:numPr>
-        <w:spacing w:after="20"/>
-      </w:pPr>
-      <w:r>
-        <w:rPr>
-          <w:color w:val="222222"/>
-          <w:sz w:val="20"/>
-          <w:szCs w:val="20"/>
-          <w:rFonts w:ascii="Calibri" w:cs="Calibri" w:eastAsia="Calibri" w:hAnsi="Calibri"/>
-        </w:rPr>
-        <w:t xml:space="preserve">Built custom </w:t>
-      </w:r>
-      <w:r>
-        <w:rPr>
-          <w:b/>
-          <w:bCs/>
-          <w:color w:val="222222"/>
-          <w:sz w:val="20"/>
-          <w:szCs w:val="20"/>
-          <w:rFonts w:ascii="Calibri" w:cs="Calibri" w:eastAsia="Calibri" w:hAnsi="Calibri"/>
-        </w:rPr>
-        <w:t xml:space="preserve">core PHP</w:t>
-      </w:r>
-      <w:r>
-        <w:rPr>
-          <w:color w:val="222222"/>
-          <w:sz w:val="20"/>
-          <w:szCs w:val="20"/>
-          <w:rFonts w:ascii="Calibri" w:cs="Calibri" w:eastAsia="Calibri" w:hAnsi="Calibri"/>
-        </w:rPr>
-        <w:t xml:space="preserve"> and MySQL applications with payment gateway integrations, including an online estimate form of </w:t>
-      </w:r>
-      <w:r>
-        <w:rPr>
-          <w:b/>
-          <w:bCs/>
-          <w:color w:val="222222"/>
-          <w:sz w:val="20"/>
-          <w:szCs w:val="20"/>
-          <w:rFonts w:ascii="Calibri" w:cs="Calibri" w:eastAsia="Calibri" w:hAnsi="Calibri"/>
-        </w:rPr>
-        <w:t xml:space="preserve">150+ fields</w:t>
-      </w:r>
-      <w:r>
-        <w:rPr>
-          <w:color w:val="222222"/>
-          <w:sz w:val="20"/>
-          <w:szCs w:val="20"/>
-          <w:rFonts w:ascii="Calibri" w:cs="Calibri" w:eastAsia="Calibri" w:hAnsi="Calibri"/>
-        </w:rPr>
-        <w:t xml:space="preserve"> with an admin workflow.</w:t>
-      </w:r>
-    </w:p>
-    <w:p>
-      <w:pPr>
-        <w:pStyle w:val="ListParagraph"/>
-        <w:numPr>
-          <w:ilvl w:val="0"/>
-          <w:numId w:val="2"/>
-        </w:numPr>
-        <w:spacing w:after="20"/>
-      </w:pPr>
-      <w:r>
-        <w:rPr>
-          <w:color w:val="222222"/>
-          <w:sz w:val="20"/>
-          <w:szCs w:val="20"/>
-          <w:rFonts w:ascii="Calibri" w:cs="Calibri" w:eastAsia="Calibri" w:hAnsi="Calibri"/>
-        </w:rPr>
-        <w:t xml:space="preserve">Developed </w:t>
-      </w:r>
-      <w:r>
-        <w:rPr>
-          <w:b/>
-          <w:bCs/>
-          <w:color w:val="222222"/>
-          <w:sz w:val="20"/>
-          <w:szCs w:val="20"/>
-          <w:rFonts w:ascii="Calibri" w:cs="Calibri" w:eastAsia="Calibri" w:hAnsi="Calibri"/>
-        </w:rPr>
-        <w:t xml:space="preserve">WordPress</w:t>
-      </w:r>
-      <w:r>
-        <w:rPr>
-          <w:color w:val="222222"/>
-          <w:sz w:val="20"/>
-          <w:szCs w:val="20"/>
-          <w:rFonts w:ascii="Calibri" w:cs="Calibri" w:eastAsia="Calibri" w:hAnsi="Calibri"/>
-        </w:rPr>
-        <w:t xml:space="preserve"> sites with custom themes and plugins for client projects.</w:t>
+        <w:pStyle w:val="ListParagraph"/>
+        <w:numPr>
+          <w:ilvl w:val="0"/>
+          <w:numId w:val="2"/>
+        </w:numPr>
+        <w:spacing w:after="20"/>
+      </w:pPr>
+      <w:r>
+        <w:rPr>
+          <w:color w:val="222222"/>
+          <w:sz w:val="20"/>
+          <w:szCs w:val="20"/>
+          <w:rFonts w:ascii="Calibri" w:cs="Calibri" w:eastAsia="Calibri" w:hAnsi="Calibri"/>
+        </w:rPr>
+        <w:t xml:space="preserve">Built a WordPress </w:t>
+      </w:r>
+      <w:r>
+        <w:rPr>
+          <w:b/>
+          <w:bCs/>
+          <w:color w:val="222222"/>
+          <w:sz w:val="20"/>
+          <w:szCs w:val="20"/>
+          <w:rFonts w:ascii="Calibri" w:cs="Calibri" w:eastAsia="Calibri" w:hAnsi="Calibri"/>
+        </w:rPr>
+        <w:t xml:space="preserve">multisite management plugin</w:t>
+      </w:r>
+      <w:r>
+        <w:rPr>
+          <w:color w:val="222222"/>
+          <w:sz w:val="20"/>
+          <w:szCs w:val="20"/>
+          <w:rFonts w:ascii="Calibri" w:cs="Calibri" w:eastAsia="Calibri" w:hAnsi="Calibri"/>
+        </w:rPr>
+        <w:t xml:space="preserve"> (wpempirebuilder.com) with one-click setup, domain mapping, cPanel integration and bulk theme and plugin activation.</w:t>
       </w:r>
     </w:p>
     <w:p>
@@ -1222,7 +1115,7 @@
         </w:numPr>
         <w:spacing w:after="20"/>
       </w:pPr>
-      <w:hyperlink w:history="1" r:id="rId2wbq_beilxgnwiuizks-z">
+      <w:hyperlink w:history="1" r:id="rIdx1qfc1onnfmmhopngkuto">
         <w:r>
           <w:rPr>
             <w:b/>
@@ -1254,7 +1147,7 @@
         </w:numPr>
         <w:spacing w:after="20"/>
       </w:pPr>
-      <w:hyperlink w:history="1" r:id="rIdklysppsawdtakzzm5o_1y">
+      <w:hyperlink w:history="1" r:id="rIdxrnxyjxy2ksomw74ke-gv">
         <w:r>
           <w:rPr>
             <w:b/>
@@ -1286,7 +1179,7 @@
         </w:numPr>
         <w:spacing w:after="20"/>
       </w:pPr>
-      <w:hyperlink w:history="1" r:id="rIdursk8qjzxiqeiyfj20hex">
+      <w:hyperlink w:history="1" r:id="rIdkbl8nq4tgepkcii7gsdz9">
         <w:r>
           <w:rPr>
             <w:b/>
@@ -1334,7 +1227,7 @@
         </w:numPr>
         <w:spacing w:after="20"/>
       </w:pPr>
-      <w:hyperlink w:history="1" r:id="rId0yqs7edn92ou-onbdgk63">
+      <w:hyperlink w:history="1" r:id="rIddfhyhetvnoup_o1z3vqrt">
         <w:r>
           <w:rPr>
             <w:b/>
@@ -1366,7 +1259,7 @@
         </w:numPr>
         <w:spacing w:after="20"/>
       </w:pPr>
-      <w:hyperlink w:history="1" r:id="rId_cxbiamtovmxiok6fed65">
+      <w:hyperlink w:history="1" r:id="rIdrprxlrxtfogzzrxyadyrk">
         <w:r>
           <w:rPr>
             <w:b/>
@@ -1398,7 +1291,7 @@
         </w:numPr>
         <w:spacing w:after="20"/>
       </w:pPr>
-      <w:hyperlink w:history="1" r:id="rIdk3kkswn2dei_hykr-j04e">
+      <w:hyperlink w:history="1" r:id="rIdvzytkyq7kqi7qz5b3mzjb">
         <w:r>
           <w:rPr>
             <w:b/>
@@ -1430,7 +1323,7 @@
         </w:numPr>
         <w:spacing w:after="20"/>
       </w:pPr>
-      <w:hyperlink w:history="1" r:id="rIdfx21v9n7f6__t1wmgdtks">
+      <w:hyperlink w:history="1" r:id="rIdzbw8j_vjvhrkgwqh6piy2">
         <w:r>
           <w:rPr>
             <w:b/>
@@ -1462,7 +1355,7 @@
         </w:numPr>
         <w:spacing w:after="20"/>
       </w:pPr>
-      <w:hyperlink w:history="1" r:id="rIddvqaiviikomvxitkbzcul">
+      <w:hyperlink w:history="1" r:id="rIdawuutg3n1l__szv_wlrxl">
         <w:r>
           <w:rPr>
             <w:b/>
@@ -1494,7 +1387,7 @@
         </w:numPr>
         <w:spacing w:after="20"/>
       </w:pPr>
-      <w:hyperlink w:history="1" r:id="rIdwqtd7ec-j1yh1epp_nmi-">
+      <w:hyperlink w:history="1" r:id="rIdg7q9irq_sqsgnbqwy7fkw">
         <w:r>
           <w:rPr>
             <w:b/>
@@ -1542,7 +1435,7 @@
         </w:numPr>
         <w:spacing w:after="20"/>
       </w:pPr>
-      <w:hyperlink w:history="1" r:id="rIdgutp18fwuzdklyy7lgujz">
+      <w:hyperlink w:history="1" r:id="rIdouguzkcyesphcy9qpro0e">
         <w:r>
           <w:rPr>
             <w:b/>
@@ -1574,7 +1467,7 @@
         </w:numPr>
         <w:spacing w:after="20"/>
       </w:pPr>
-      <w:hyperlink w:history="1" r:id="rIdygax0xcyyuf_jllqo0z3w">
+      <w:hyperlink w:history="1" r:id="rIdp4bbhe_dgas7lxttepqjn">
         <w:r>
           <w:rPr>
             <w:b/>
@@ -1606,7 +1499,7 @@
         </w:numPr>
         <w:spacing w:after="20"/>
       </w:pPr>
-      <w:hyperlink w:history="1" r:id="rIdusakxm-wf966at4nb--79">
+      <w:hyperlink w:history="1" r:id="rIdglvfm3fgfwtyhu8d3tunj">
         <w:r>
           <w:rPr>
             <w:b/>
@@ -1774,7 +1667,7 @@
         </w:numPr>
         <w:spacing w:after="20"/>
       </w:pPr>
-      <w:hyperlink w:history="1" r:id="rIditztu8ix_tzcj2es-q-5a">
+      <w:hyperlink w:history="1" r:id="rIdhegvdlwx1qtaoctj0jkfc">
         <w:r>
           <w:rPr>
             <w:b/>
@@ -1806,7 +1699,7 @@
         </w:numPr>
         <w:spacing w:after="20"/>
       </w:pPr>
-      <w:hyperlink w:history="1" r:id="rId5pp0dndqyrwcpvzoacyom">
+      <w:hyperlink w:history="1" r:id="rIdjy4kad80s6lkkd1tynbip">
         <w:r>
           <w:rPr>
             <w:b/>
@@ -1854,7 +1747,7 @@
         </w:numPr>
         <w:spacing w:after="20"/>
       </w:pPr>
-      <w:hyperlink w:history="1" r:id="rIdmbq4dl-ayzmsrspz69icw">
+      <w:hyperlink w:history="1" r:id="rIdlrfgbwonvx43kx665757b">
         <w:r>
           <w:rPr>
             <w:b/>
@@ -1886,7 +1779,7 @@
         </w:numPr>
         <w:spacing w:after="20"/>
       </w:pPr>
-      <w:hyperlink w:history="1" r:id="rIdaouew1tq46exlnpwa9uhk">
+      <w:hyperlink w:history="1" r:id="rIdkxbjancib8e0pzn2ynvie">
         <w:r>
           <w:rPr>
             <w:b/>
@@ -1918,7 +1811,7 @@
         </w:numPr>
         <w:spacing w:after="20"/>
       </w:pPr>
-      <w:hyperlink w:history="1" r:id="rIdlv4abhhrtmrcjavxdvwxv">
+      <w:hyperlink w:history="1" r:id="rIdhy3mmuexwfsxzicxr8olw">
         <w:r>
           <w:rPr>
             <w:b/>
@@ -1980,7 +1873,7 @@
         </w:numPr>
         <w:spacing w:after="20"/>
       </w:pPr>
-      <w:hyperlink w:history="1" r:id="rId33qirfvm0epwg3nixsuje">
+      <w:hyperlink w:history="1" r:id="rIdth6xvtle7lfgs9kurbmyx">
         <w:r>
           <w:rPr>
             <w:b/>
@@ -2012,7 +1905,7 @@
         </w:numPr>
         <w:spacing w:after="20"/>
       </w:pPr>
-      <w:hyperlink w:history="1" r:id="rId6mkihhih59ki4c3mwym6q">
+      <w:hyperlink w:history="1" r:id="rIdz7locxvzbxmh4bumhos56">
         <w:r>
           <w:rPr>
             <w:b/>
@@ -2060,7 +1953,7 @@
         </w:numPr>
         <w:spacing w:after="20"/>
       </w:pPr>
-      <w:hyperlink w:history="1" r:id="rIdaxtwzr1lbfh-ajoqzcx3e">
+      <w:hyperlink w:history="1" r:id="rIdfhim_ci7boioas6jga84c">
         <w:r>
           <w:rPr>
             <w:b/>
@@ -2092,7 +1985,7 @@
         </w:numPr>
         <w:spacing w:after="20"/>
       </w:pPr>
-      <w:hyperlink w:history="1" r:id="rIdxlzwsob0pu1o6hkueovew">
+      <w:hyperlink w:history="1" r:id="rId7fygzesafwmzwicmx0ypr">
         <w:r>
           <w:rPr>
             <w:b/>

</xml_diff>